<commit_message>
SGD: guion serverless — lámina 7 reescrita (isolates de V8 explicado más simple)
Co-Authored-By: Claude Opus 5.5 <noreply@anthropic.com>
</commit_message>
<xml_diff>
--- a/materias/SGD/entregables/serverless/guion-presentacion.docx
+++ b/materias/SGD/entregables/serverless/guion-presentacion.docx
@@ -528,7 +528,7 @@
                 <w:szCs w:val="18"/>
                 <w:lang w:val="es-AR"/>
               </w:rPr>
-              <w:t xml:space="preserve">3:45</w:t>
+              <w:t xml:space="preserve">4:00</w:t>
             </w:r>
           </w:p>
         </w:tc>
@@ -558,7 +558,7 @@
                 <w:szCs w:val="18"/>
                 <w:lang w:val="es-AR"/>
               </w:rPr>
-              <w:t xml:space="preserve">7:15</w:t>
+              <w:t xml:space="preserve">7:30</w:t>
             </w:r>
           </w:p>
         </w:tc>
@@ -714,7 +714,7 @@
                 <w:szCs w:val="18"/>
                 <w:lang w:val="es-AR"/>
               </w:rPr>
-              <w:t xml:space="preserve">11:05</w:t>
+              <w:t xml:space="preserve">11:20</w:t>
             </w:r>
           </w:p>
         </w:tc>
@@ -870,7 +870,7 @@
                 <w:szCs w:val="18"/>
                 <w:lang w:val="es-AR"/>
               </w:rPr>
-              <w:t xml:space="preserve">14:35</w:t>
+              <w:t xml:space="preserve">14:50</w:t>
             </w:r>
           </w:p>
         </w:tc>
@@ -894,7 +894,7 @@
           <w:szCs w:val="22"/>
           <w:lang w:val="es-AR"/>
         </w:rPr>
-        <w:t xml:space="preserve">El texto hablado dura unos 12:45 a 145 palabras por minuto; el resto es margen para pausas, cambios de expositor y algún imprevisto. Los bloques 2 y 3 son los más técnicos: conviene que los tomen quienes mejor manejen el tema.</w:t>
+        <w:t xml:space="preserve">El texto hablado dura unos 13:10 a 145 palabras por minuto; el resto es margen para pausas, cambios de expositor y algún imprevisto. Los bloques 2 y 3 son los más técnicos: conviene que los tomen quienes mejor manejen el tema.</w:t>
       </w:r>
     </w:p>
     <w:p>
@@ -1455,7 +1455,7 @@
           <w:szCs w:val="22"/>
           <w:lang w:val="es-AR"/>
         </w:rPr>
-        <w:t xml:space="preserve">Expositor 2 · 1:15</w:t>
+        <w:t xml:space="preserve">Expositor 2 · 1:40</w:t>
       </w:r>
     </w:p>
     <w:p>
@@ -1503,7 +1503,23 @@
           <w:szCs w:val="22"/>
           <w:lang w:val="es-AR"/>
         </w:rPr>
-        <w:t xml:space="preserve">Cloudflare tomó el camino opuesto: isolates de V8, el motor de JavaScript de Chrome. Un solo proceso aloja miles de funciones aisladas entre sí. Arrancan unas cien veces más rápido que un proceso de Node, así que el cold start prácticamente desaparece. El costo es que el aislamiento es por software y solo corre JavaScript o WebAssembly.</w:t>
+        <w:t xml:space="preserve">Cloudflare eligió el camino opuesto. En vez de darle a cada función su propia máquina virtual, mete miles de funciones dentro de un mismo programa: V8, el motor que ejecuta JavaScript en Chrome. Adentro de ese programa, cada función vive en un compartimento separado, que se llama isolate, con sus propias variables y sin poder ver las de las demás.</w:t>
+      </w:r>
+    </w:p>
+    <w:p>
+      <w:pPr>
+        <w:spacing w:after="120" w:line="280"/>
+        <w:jc w:val="both"/>
+      </w:pPr>
+      <w:r>
+        <w:rPr>
+          <w:rFonts w:ascii="Lexend" w:cs="Lexend" w:eastAsia="Lexend" w:hAnsi="Lexend"/>
+          <w:color w:val="1A1A1A"/>
+          <w:sz w:val="22"/>
+          <w:szCs w:val="22"/>
+          <w:lang w:val="es-AR"/>
+        </w:rPr>
+        <w:t xml:space="preserve">La ventaja es la velocidad. Como el motor ya está andando, sumar una función nueva es casi instantáneo: unas cien veces más rápido que arrancar un programa de Node desde cero. El cold start prácticamente desaparece. La contra son dos cosas: la separación entre clientes la hace el software, no el hardware, y solo se puede correr JavaScript o WebAssembly.</w:t>
       </w:r>
     </w:p>
     <w:p>

</xml_diff>